<commit_message>
feat: Update calendar document for 2026/2027 and enhance data structure
</commit_message>
<xml_diff>
--- a/2_labs/linux/Calendario_Safra_Conselho_Landscape.docx
+++ b/2_labs/linux/Calendario_Safra_Conselho_Landscape.docx
@@ -7,7 +7,7 @@
         <w:pStyle w:val="Title"/>
       </w:pPr>
       <w:r>
-        <w:t>Calendário Integrado: Governança &amp; Safra (2025/2026)</w:t>
+        <w:t>Calendário Integrado: Governança &amp; Safra (2026/2027)</w:t>
       </w:r>
     </w:p>
     <w:tbl>
@@ -107,7 +107,7 @@
           </w:tcPr>
           <w:p>
             <w:r>
-              <w:t>Avaliação Trimestral de Desempenho Q3</w:t>
+              <w:t>Estratégia Corporativa e Cenário Financeiro</w:t>
             </w:r>
           </w:p>
         </w:tc>
@@ -117,13 +117,19 @@
           </w:tcPr>
           <w:p>
             <w:r>
-              <w:t>• Resultados Q3 (Out-Dez).</w:t>
+              <w:t>• Acompanhamento da Dívida e captações.</w:t>
               <w:br/>
-              <w:t>• Evento de início de ano.</w:t>
+              <w:t>• Projeção de fluxo de caixa.</w:t>
               <w:br/>
-              <w:t>• Políticas de Gestão e Risco.</w:t>
+              <w:t>• Acompanhamento mensal dos projetos de investimentos aprovados (cronograma de execução e retorno realizado x esperado).</w:t>
               <w:br/>
-              <w:t>Obs: Foco no trimestre anterior.</w:t>
+              <w:t>• Políticas de Gestão de Risco.</w:t>
+              <w:br/>
+              <w:t>• Fluxo de caixa e Endividamento.</w:t>
+              <w:br/>
+              <w:t>• Definir evento anual de liderança.</w:t>
+              <w:br/>
+              <w:t>• Evoluções na planilha de controle: apresentação de Hedges e Comercialização de Gado.</w:t>
             </w:r>
           </w:p>
         </w:tc>
@@ -133,7 +139,7 @@
           </w:tcPr>
           <w:p>
             <w:r>
-              <w:t>AVB; Pessoas</w:t>
+              <w:t>AVB; Pessoas; Fernanda; José Carlos; Laguna; Beatriz;</w:t>
             </w:r>
           </w:p>
         </w:tc>
@@ -173,7 +179,7 @@
           </w:tcPr>
           <w:p>
             <w:r>
-              <w:t>Estratégia Corporativa e Cenário Financeiro</w:t>
+              <w:t>Apresentação de Resultados (Safra anterior)</w:t>
             </w:r>
           </w:p>
         </w:tc>
@@ -183,15 +189,17 @@
           </w:tcPr>
           <w:p>
             <w:r>
-              <w:t>• Definir evento anual de liderança.</w:t>
+              <w:t>• Acompanhamento da Dívida e captações.</w:t>
               <w:br/>
-              <w:t>• Painel de indicadores (ROA, ROIC, TIR).</w:t>
+              <w:t>• Projeção de fluxo de caixa.</w:t>
               <w:br/>
-              <w:t>• Fluxo de caixa e endividamento.</w:t>
+              <w:t>• Acompanhamento mensal dos projetos de investimentos aprovados (cronograma de execução e retorno realizado x esperado).</w:t>
               <w:br/>
-              <w:t>• Políticas de Gestão e Risco.</w:t>
+              <w:t>• Políticas de Gestão de Risco.</w:t>
               <w:br/>
-              <w:t>Obs: Fundamenta decisões de julho.</w:t>
+              <w:t>• Resultados operacionais por unidade e consolidado, safra anterior.</w:t>
+              <w:br/>
+              <w:t>• Discutir e formalizar a política de comercialização de Gado (versão final).</w:t>
             </w:r>
           </w:p>
         </w:tc>
@@ -201,7 +209,7 @@
           </w:tcPr>
           <w:p>
             <w:r>
-              <w:t>Pessoas; ECOWA; AVB</w:t>
+              <w:t>AVB; Laguna; Frank; Claudia; Beatriz; José Neto;</w:t>
             </w:r>
           </w:p>
         </w:tc>
@@ -233,7 +241,7 @@
           </w:tcPr>
           <w:p>
             <w:r>
-              <w:t>Apresentação de Resultados (Safra anterior)</w:t>
+              <w:t>Feedback implantação sistema Senior</w:t>
             </w:r>
           </w:p>
         </w:tc>
@@ -243,11 +251,19 @@
           </w:tcPr>
           <w:p>
             <w:r>
-              <w:t>• Resultados operacionais por unidade e consolidado.</w:t>
+              <w:t>• Acompanhamento da Dívida e captações.</w:t>
               <w:br/>
-              <w:t>• Políticas de Gestão e Risco.</w:t>
+              <w:t>• Projeção de fluxo de caixa.</w:t>
               <w:br/>
-              <w:t>Obs: Consolidação da performance anual.</w:t>
+              <w:t>• Acompanhamento mensal dos projetos de investimentos aprovados (cronograma de execução e retorno realizado x esperado).</w:t>
+              <w:br/>
+              <w:t>• Políticas de Gestão de Risco.</w:t>
+              <w:br/>
+              <w:t>• Feedback migração ERP Senior.</w:t>
+              <w:br/>
+              <w:t>• Planejamento estratégico. Cenário econômico safra 26/27 para eventuais revisões de orçamento e fluxo de caixa.</w:t>
+              <w:br/>
+              <w:t>• Diretrizes iniciais para desenvolvimento da política de comercialização de Cana (escopo, responsáveis e cronograma).</w:t>
             </w:r>
           </w:p>
         </w:tc>
@@ -257,7 +273,7 @@
           </w:tcPr>
           <w:p>
             <w:r>
-              <w:t>AVB</w:t>
+              <w:t>AVB; Fernanda; Claudia; Frank; José Carlos; Helcio; Mayke; Beatriz;</w:t>
             </w:r>
           </w:p>
         </w:tc>
@@ -267,9 +283,9 @@
           </w:tcPr>
           <w:p>
             <w:r>
-              <w:t>• [São Judas] Safrinha Milho: Fim Colheita (1ª Semana)</w:t>
+              <w:t>• [São Judas] Safrinha Milho: Fim Colheita (2ª Quinzena)</w:t>
               <w:br/>
-              <w:t>• [Rancho Alegre] Safrinha Milho: Fim Colheita (1ª Semana)</w:t>
+              <w:t>• [Rancho Alegre] Safrinha Milho: Fim Colheita (2ª Quinzena)</w:t>
             </w:r>
           </w:p>
         </w:tc>
@@ -291,7 +307,7 @@
           </w:tcPr>
           <w:p>
             <w:r>
-              <w:t>Discussões Estratégicas de Longo Prazo</w:t>
+              <w:t>Painel de Indicadores</w:t>
             </w:r>
           </w:p>
         </w:tc>
@@ -301,11 +317,15 @@
           </w:tcPr>
           <w:p>
             <w:r>
-              <w:t>• Planejamento estratégico LP: revisão anual.</w:t>
+              <w:t>• Acompanhamento da Dívida e captações.</w:t>
               <w:br/>
-              <w:t>• Políticas de Gestão e Risco.</w:t>
+              <w:t>• Projeção de fluxo de caixa.</w:t>
               <w:br/>
-              <w:t>Obs: Alinhamento com tendências.</w:t>
+              <w:t>• Acompanhamento mensal dos projetos de investimentos aprovados (cronograma de execução e retorno realizado x esperado).</w:t>
+              <w:br/>
+              <w:t>• Políticas de Gestão de Risco.</w:t>
+              <w:br/>
+              <w:t>• Painel de indicadores (ROA, ROIC, TIR).</w:t>
             </w:r>
           </w:p>
         </w:tc>
@@ -315,7 +335,7 @@
           </w:tcPr>
           <w:p>
             <w:r>
-              <w:t>ECOWA</w:t>
+              <w:t>ECOWA; Fernanda; Laguna; Beatriz;</w:t>
             </w:r>
           </w:p>
         </w:tc>
@@ -347,7 +367,7 @@
           </w:tcPr>
           <w:p>
             <w:r>
-              <w:t>Avaliação Trimestral de Desempenho Q1</w:t>
+              <w:t>Encerramento KPMG e Controle Interno</w:t>
             </w:r>
           </w:p>
         </w:tc>
@@ -357,11 +377,19 @@
           </w:tcPr>
           <w:p>
             <w:r>
-              <w:t>• Resultados Q1 (Abr-Jun).</w:t>
+              <w:t>• Acompanhamento da Dívida e captações.</w:t>
               <w:br/>
-              <w:t>• Políticas de Gestão e Risco.</w:t>
+              <w:t>• Projeção de fluxo de caixa.</w:t>
               <w:br/>
-              <w:t>Obs: Avaliação dos primeiros meses.</w:t>
+              <w:t>• Acompanhamento mensal dos projetos de investimentos aprovados (cronograma de execução e retorno realizado x esperado).</w:t>
+              <w:br/>
+              <w:t>• Resultados Q1 (Abr-Jun) / e-mail pacote.</w:t>
+              <w:br/>
+              <w:t>• Políticas de Gestão de Risco.</w:t>
+              <w:br/>
+              <w:t>• Apresentação KPMG e Controle interno.</w:t>
+              <w:br/>
+              <w:t>• Feedback migração ERP Senior.</w:t>
             </w:r>
           </w:p>
         </w:tc>
@@ -371,7 +399,7 @@
           </w:tcPr>
           <w:p>
             <w:r>
-              <w:t>AVB</w:t>
+              <w:t>AVB; Laguna; José Neto; Beatriz; Frank; Claudia; KPMG;</w:t>
             </w:r>
           </w:p>
         </w:tc>
@@ -403,7 +431,7 @@
           </w:tcPr>
           <w:p>
             <w:r>
-              <w:t>Monitoramento de Políticas Corporativas</w:t>
+              <w:t>Planejamento estratégico</w:t>
             </w:r>
           </w:p>
         </w:tc>
@@ -413,9 +441,21 @@
           </w:tcPr>
           <w:p>
             <w:r>
-              <w:t>• Políticas de Gestão e Risco (foco exclusivo).</w:t>
+              <w:t>• Acompanhamento da Dívida e captações.</w:t>
+              <w:br/>
+              <w:t>• Projeção de fluxo de caixa.</w:t>
+              <w:br/>
+              <w:t>• Acompanhamento mensal dos projetos de investimentos aprovados (cronograma de execução e retorno realizado x esperado).</w:t>
+              <w:br/>
+              <w:t>• Políticas de Gestão de Risco (foco exclusivo).</w:t>
               <w:br/>
               <w:t>Obs: Monitoramento de políticas internas.</w:t>
+              <w:br/>
+              <w:t>• Planejamento estratégico, revisão do plurianual.</w:t>
+              <w:br/>
+              <w:t>• Revisão do cronograma anual de reuniões para detalhar marcos operacionais (inclui análise do plantio da Soja em dezembro).</w:t>
+              <w:br/>
+              <w:t>• Política de comercialização de Cana: proposta inicial e plano de evolução.</w:t>
             </w:r>
           </w:p>
         </w:tc>
@@ -425,7 +465,7 @@
           </w:tcPr>
           <w:p>
             <w:r>
-              <w:t>ECOWA</w:t>
+              <w:t>Fernanda; Laguna; Beatriz;</w:t>
             </w:r>
           </w:p>
         </w:tc>
@@ -467,9 +507,15 @@
           </w:tcPr>
           <w:p>
             <w:r>
+              <w:t>• Acompanhamento da Dívida e captações.</w:t>
+              <w:br/>
+              <w:t>• Projeção de fluxo de caixa.</w:t>
+              <w:br/>
+              <w:t>• Acompanhamento mensal dos projetos de investimentos aprovados (cronograma de execução e retorno realizado x esperado).</w:t>
+              <w:br/>
               <w:t>• Demandas emergenciais.</w:t>
               <w:br/>
-              <w:t>• Políticas de Gestão e Risco.</w:t>
+              <w:t>• Políticas de Gestão de Risco.</w:t>
               <w:br/>
               <w:t>Obs: Revisões excepcionais.</w:t>
             </w:r>
@@ -481,7 +527,7 @@
           </w:tcPr>
           <w:p>
             <w:r>
-              <w:t>ECOWA</w:t>
+              <w:t>Laguna; Beatriz;</w:t>
             </w:r>
           </w:p>
         </w:tc>
@@ -533,11 +579,15 @@
           </w:tcPr>
           <w:p>
             <w:r>
-              <w:t>• Resultados Q2 (Jul-Set).</w:t>
+              <w:t>• Acompanhamento da Dívida e captações.</w:t>
               <w:br/>
-              <w:t>• Políticas de Gestão e Risco.</w:t>
+              <w:t>• Projeção de fluxo de caixa.</w:t>
               <w:br/>
-              <w:t>Obs: Visão de desempenho meses centrais.</w:t>
+              <w:t>• Acompanhamento mensal dos projetos de investimentos aprovados (cronograma de execução e retorno realizado x esperado).</w:t>
+              <w:br/>
+              <w:t>• Resultados Q2 (Jul-Set) / e-mail pacote.</w:t>
+              <w:br/>
+              <w:t>• Políticas de Gestão de Risco.</w:t>
             </w:r>
           </w:p>
         </w:tc>
@@ -547,7 +597,7 @@
           </w:tcPr>
           <w:p>
             <w:r>
-              <w:t>AVB; ECOWA</w:t>
+              <w:t>AVB; Laguna; Beatriz; José Neto;</w:t>
             </w:r>
           </w:p>
         </w:tc>
@@ -589,11 +639,21 @@
           </w:tcPr>
           <w:p>
             <w:r>
+              <w:t>• Acompanhamento da Dívida e captações.</w:t>
+              <w:br/>
+              <w:t>• Projeção de fluxo de caixa.</w:t>
+              <w:br/>
+              <w:t>• Acompanhamento mensal dos projetos de investimentos aprovados (cronograma de execução e retorno realizado x esperado).</w:t>
+              <w:br/>
               <w:t>• Simulações fechamento ano safra.</w:t>
               <w:br/>
-              <w:t>• Políticas de Gestão e Risco.</w:t>
+              <w:t>• Políticas de Gestão de Risco.</w:t>
               <w:br/>
-              <w:t>Obs: Insumo para CAPEX de fevereiro.</w:t>
+              <w:t>• Projeção para CAPEX de fevereiro.</w:t>
+              <w:br/>
+              <w:t>• Planejamento estratégico. Cenário econômico safra 26/27 para eventuais revisões de orçamento e fluxo de caixa.</w:t>
+              <w:br/>
+              <w:t>• Análise do plantio da Soja (status, aderência ao plano, riscos e lições aprendidas).</w:t>
             </w:r>
           </w:p>
         </w:tc>
@@ -603,7 +663,7 @@
           </w:tcPr>
           <w:p>
             <w:r>
-              <w:t>AVB; ECOWA</w:t>
+              <w:t>AVB; Fernanda; Laguna; Beatriz; José Neto;</w:t>
             </w:r>
           </w:p>
         </w:tc>
@@ -703,13 +763,23 @@
           </w:tcPr>
           <w:p>
             <w:r>
+              <w:t>• Acompanhamento da Dívida e captações.</w:t>
+              <w:br/>
+              <w:t>• Projeção de fluxo de caixa.</w:t>
+              <w:br/>
+              <w:t>• Acompanhamento mensal dos projetos de investimentos aprovados (cronograma de execução e retorno realizado x esperado).</w:t>
+              <w:br/>
               <w:t>• Apresentação CAPEX próxima safra.</w:t>
               <w:br/>
               <w:t>• Estrutura de capital.</w:t>
               <w:br/>
-              <w:t>• Políticas de Gestão e Risco (mensal).</w:t>
+              <w:t>• Políticas de Gestão de Risco (mensal).</w:t>
               <w:br/>
               <w:t>Obs: Base para definição de metas em março.</w:t>
+              <w:br/>
+              <w:t>• Resultados Q3 (Out-Dez) / e-mail pacote.</w:t>
+              <w:br/>
+              <w:t>• Planejamento estratégico. Cenário econômico safra 26/27 para eventuais revisões de orçamento e fluxo de caixa.</w:t>
             </w:r>
           </w:p>
         </w:tc>
@@ -719,7 +789,7 @@
           </w:tcPr>
           <w:p>
             <w:r>
-              <w:t>AVB; MOP; ECOWA</w:t>
+              <w:t>AVB; MOP; ECOWA; Laguna; Beatriz; José Neto;</w:t>
             </w:r>
           </w:p>
         </w:tc>
@@ -771,13 +841,19 @@
           </w:tcPr>
           <w:p>
             <w:r>
+              <w:t>• Acompanhamento da Dívida e captações.</w:t>
+              <w:br/>
+              <w:t>• Projeção de fluxo de caixa.</w:t>
+              <w:br/>
+              <w:t>• Acompanhamento mensal dos projetos de investimentos aprovados (cronograma de execução e retorno realizado x esperado).</w:t>
+              <w:br/>
               <w:t>• Aprovação do Orçamento Operacional.</w:t>
               <w:br/>
               <w:t>• Estabelecimento das metas das Unidades.</w:t>
               <w:br/>
               <w:t>• Plano de comunicação das metas.</w:t>
               <w:br/>
-              <w:t>• Políticas de Gestão e Risco.</w:t>
+              <w:t>• Políticas de Gestão de Risco.</w:t>
               <w:br/>
               <w:t>Obs: Metas monitoradas trimestralmente.</w:t>
             </w:r>
@@ -789,7 +865,7 @@
           </w:tcPr>
           <w:p>
             <w:r>
-              <w:t>AVB; MOP; ECOWA</w:t>
+              <w:t>AVB; MOP; Laguna; Beatriz; Frank; Claudia; José Neto;</w:t>
             </w:r>
           </w:p>
         </w:tc>

</xml_diff>